<commit_message>
docs(status): content tools + free-tool paywall — done & to-complete
- Performance status (docx): +content-tools row in "מה נעשה"; dated 09.08 update
  block with the website free tool, email gate, 4-use quota, and the pending
  Supabase SQL / Vercel env steps.
- Connections (xlsx): OPS sheet +content-tools row; Content Tool Landing sheet
  already flags content_leads.sql + content_tool_usage.sql as "🔧 צריך לטפל".

Co-Authored-By: Claude Opus 4.8 (1M context) <noreply@anthropic.com>
</commit_message>
<xml_diff>
--- a/PRODUCTS/HELIX-OPS-PERFORMANCE-STATUS.docx
+++ b/PRODUCTS/HELIX-OPS-PERFORMANCE-STATUS.docx
@@ -501,6 +501,38 @@
           </w:p>
         </w:tc>
       </w:tr>
+      <w:tr>
+        <w:tc>
+          <w:tcPr>
+            <w:tcW w:type="dxa" w:w="2880"/>
+          </w:tcPr>
+          <w:p>
+            <w:r>
+              <w:t>כלי תוכן (Content DNA + בניית פוסט + מיילים)</w:t>
+            </w:r>
+          </w:p>
+        </w:tc>
+        <w:tc>
+          <w:tcPr>
+            <w:tcW w:type="dxa" w:w="2880"/>
+          </w:tcPr>
+          <w:p>
+            <w:r>
+              <w:t>3 כרטיסים חדשים בגריד ה-Performance: ניתוח DNA של פוסטים, בניית פוסט (לפי הנוסחה, HE/EN), כתיבה/שכתוב מיילים HE/EN. מנוע Claude (askJson). מקבילים לכלי החינמי באתר /free-tools/content.</w:t>
+            </w:r>
+          </w:p>
+        </w:tc>
+        <w:tc>
+          <w:tcPr>
+            <w:tcW w:type="dxa" w:w="2880"/>
+          </w:tcPr>
+          <w:p>
+            <w:r>
+              <w:t>lib/performance/content-dna.ts · content-tool.ts · components/{ContentDnaCard,PostBuilderCard,EmailWriterCard}.tsx · app/api/content-{dna,tool}</w:t>
+            </w:r>
+          </w:p>
+        </w:tc>
+      </w:tr>
     </w:tbl>
     <w:p>
       <w:pPr>
@@ -658,6 +690,89 @@
           <w:sz w:val="22"/>
         </w:rPr>
         <w:t>ניקוד Bayesian היברידי (prior של AI + דאטה מנורמלת לבייסליין של הלקוח) — הם רק "ניתוח יומי + המלצות". מצב brain-only (מוח בלבד) לצד connector. פלטפורמת-על: performance-lean עכשיו, upsell ל-engagement/post-writing.</w:t>
+      </w:r>
+    </w:p>
+    <w:p/>
+    <w:p>
+      <w:r>
+        <w:rPr>
+          <w:b/>
+          <w:sz w:val="26"/>
+        </w:rPr>
+        <w:t>עדכון 09.08.2026 — כלי תוכן (OPS + אתר) + paywall</w:t>
+      </w:r>
+    </w:p>
+    <w:p>
+      <w:pPr>
+        <w:pStyle w:val="ListBullet"/>
+      </w:pPr>
+      <w:r>
+        <w:t>OPS: נוספו 3 כרטיסי תוכן לגריד ה-Performance (Content DNA + בניית פוסט + מיילים HE/EN). נדחף ל-origin/feat/performance-module (db68738). ללא SQL נוסף — משתמש ב-ANTHROPIC_API_KEY הקיים.</w:t>
+      </w:r>
+    </w:p>
+    <w:p>
+      <w:pPr>
+        <w:pStyle w:val="ListBullet"/>
+      </w:pPr>
+      <w:r>
+        <w:t>אתר: נבנה כלי חינמי /free-tools/content (ניתוח/בנייה/מיילים HE+EN) + סקשן "בדיקות חינם" בהאדר (GEO + מוכנות + תוכן; הקישורים הישנים נשארו). נדחף ל-remote vercel (f7945e5, 112033e). המבורגר הוקדם ל-1279 כדי שהניווט לא יישבר.</w:t>
+      </w:r>
+    </w:p>
+    <w:p>
+      <w:pPr>
+        <w:pStyle w:val="ListBullet"/>
+      </w:pPr>
+      <w:r>
+        <w:t>שער מייל: חובה להשאיר מייל כדי להשתמש — נאכף בשרת (/api/content-tool מחזיר 403 בלי מייל). הליד נשמר ל-Supabase content_leads + התראת Resend.</w:t>
+      </w:r>
+    </w:p>
+    <w:p>
+      <w:pPr>
+        <w:pStyle w:val="ListBullet"/>
+      </w:pPr>
+      <w:r>
+        <w:t>Paywall: 4 שימושים חינמיים (בנייה + מיילים; ניתוח DNA חינם וללא הגבלה) → מסך שדרוג ל-HELIX OPS (my.helix.co.il). ספירה ב-Supabase content_tool_usage; /api/content-tool מחזיר 402 quota_exceeded אחרי 4.</w:t>
+      </w:r>
+    </w:p>
+    <w:p>
+      <w:r>
+        <w:rPr>
+          <w:b/>
+          <w:sz w:val="26"/>
+        </w:rPr>
+        <w:t>מה צריך להשלים (כלי התוכן החינמי)</w:t>
+      </w:r>
+    </w:p>
+    <w:p>
+      <w:pPr>
+        <w:pStyle w:val="ListBullet"/>
+      </w:pPr>
+      <w:r>
+        <w:t>⚠️ להריץ ב-Supabase SQL editor: docs/content_leads.sql (לכידת מיילים) ו-docs/content_tool_usage.sql (ספירת ה-quota).</w:t>
+      </w:r>
+    </w:p>
+    <w:p>
+      <w:pPr>
+        <w:pStyle w:val="ListBullet"/>
+      </w:pPr>
+      <w:r>
+        <w:t>⚠️ לוודא ש-SUPABASE_URL + SUPABASE_SERVICE_KEY מוגדרים ב-Vercel (של אתר helix). בלעדיהם: לא נשמרים לידים וה-quota "unlimited".</w:t>
+      </w:r>
+    </w:p>
+    <w:p>
+      <w:pPr>
+        <w:pStyle w:val="ListBullet"/>
+      </w:pPr>
+      <w:r>
+        <w:t>⚠️ הכלי עובד רק על דפלוי ה-Vercel — האתר החי (Firebase static) מחזיר 404 לכל /api/*. לבדוק על URL של Vercel.</w:t>
+      </w:r>
+    </w:p>
+    <w:p>
+      <w:pPr>
+        <w:pStyle w:val="ListBullet"/>
+      </w:pPr>
+      <w:r>
+        <w:t>אופציונלי: RESEND_API_KEY + RESEND_NOTIFY_TO — להתראת מייל על כל ליד חדש (לא חוסם).</w:t>
       </w:r>
     </w:p>
     <w:sectPr>

</xml_diff>